<commit_message>
«Du sparer» i Word, norske beskrivelser fra Hultafors-sidene
- Sumtabellen viser veil. pris og «Du sparer −X kr (Y %)» når kunden
  får noe under veil. Malendringen er maler/sparelinje.py.
- Snickers, Solid Gear og Hellberg: beskrivelsen hentes fra sidens
  norske tekst, ikke fra JSON-LD (kort hos Solid Gear, engelsk hos Snickers).

Co-Authored-By: Claude Opus 5.5 <noreply@anthropic.com>
</commit_message>
<xml_diff>
--- a/maler/tilbud-mal.docx
+++ b/maler/tilbud-mal.docx
@@ -691,6 +691,166 @@
                 <w:color w:val="767676"/>
                 <w:sz w:val="19"/>
               </w:rPr>
+              <w:t>{%tr if spart %}</w:t>
+            </w:r>
+          </w:p>
+        </w:tc>
+        <w:tc>
+          <w:tcPr>
+            <w:tcW w:type="dxa" w:w="4873"/>
+          </w:tcPr>
+          <w:p>
+            <w:pPr>
+              <w:spacing w:after="0"/>
+              <w:jc w:val="right"/>
+            </w:pPr>
+            <w:r>
+              <w:rPr>
+                <w:b w:val="0"/>
+                <w:color w:val="767676"/>
+                <w:sz w:val="19"/>
+              </w:rPr>
+              <w:t/>
+            </w:r>
+          </w:p>
+        </w:tc>
+      </w:tr>
+      <w:tr>
+        <w:tc>
+          <w:tcPr>
+            <w:tcW w:type="dxa" w:w="4873"/>
+          </w:tcPr>
+          <w:p>
+            <w:pPr>
+              <w:spacing w:after="0"/>
+              <w:jc w:val="right"/>
+            </w:pPr>
+            <w:r>
+              <w:rPr>
+                <w:b w:val="0"/>
+                <w:color w:val="767676"/>
+                <w:sz w:val="19"/>
+              </w:rPr>
+              <w:t>Veil. pris eks. mva</w:t>
+            </w:r>
+          </w:p>
+        </w:tc>
+        <w:tc>
+          <w:tcPr>
+            <w:tcW w:type="dxa" w:w="4873"/>
+          </w:tcPr>
+          <w:p>
+            <w:pPr>
+              <w:spacing w:after="0"/>
+              <w:jc w:val="right"/>
+            </w:pPr>
+            <w:r>
+              <w:rPr>
+                <w:b w:val="0"/>
+                <w:color w:val="767676"/>
+                <w:sz w:val="19"/>
+              </w:rPr>
+              <w:t>{{ veil_eks_mva }} kr</w:t>
+            </w:r>
+          </w:p>
+        </w:tc>
+      </w:tr>
+      <w:tr>
+        <w:tc>
+          <w:tcPr>
+            <w:tcW w:type="dxa" w:w="4873"/>
+          </w:tcPr>
+          <w:p>
+            <w:pPr>
+              <w:spacing w:after="0"/>
+              <w:jc w:val="right"/>
+            </w:pPr>
+            <w:r>
+              <w:rPr>
+                <w:b w:val="1"/>
+                <w:color w:val="12100C"/>
+                <w:sz w:val="19"/>
+              </w:rPr>
+              <w:t>Du sparer</w:t>
+            </w:r>
+          </w:p>
+        </w:tc>
+        <w:tc>
+          <w:tcPr>
+            <w:tcW w:type="dxa" w:w="4873"/>
+          </w:tcPr>
+          <w:p>
+            <w:pPr>
+              <w:spacing w:after="0"/>
+              <w:jc w:val="right"/>
+            </w:pPr>
+            <w:r>
+              <w:rPr>
+                <w:b w:val="1"/>
+                <w:color w:val="12100C"/>
+                <w:sz w:val="19"/>
+              </w:rPr>
+              <w:t>−{{ spart }} kr ({{ spart_prosent }} %)</w:t>
+            </w:r>
+          </w:p>
+        </w:tc>
+      </w:tr>
+      <w:tr>
+        <w:tc>
+          <w:tcPr>
+            <w:tcW w:type="dxa" w:w="4873"/>
+          </w:tcPr>
+          <w:p>
+            <w:pPr>
+              <w:spacing w:after="0"/>
+              <w:jc w:val="right"/>
+            </w:pPr>
+            <w:r>
+              <w:rPr>
+                <w:b w:val="0"/>
+                <w:color w:val="767676"/>
+                <w:sz w:val="19"/>
+              </w:rPr>
+              <w:t>{%tr endif %}</w:t>
+            </w:r>
+          </w:p>
+        </w:tc>
+        <w:tc>
+          <w:tcPr>
+            <w:tcW w:type="dxa" w:w="4873"/>
+          </w:tcPr>
+          <w:p>
+            <w:pPr>
+              <w:spacing w:after="0"/>
+              <w:jc w:val="right"/>
+            </w:pPr>
+            <w:r>
+              <w:rPr>
+                <w:b w:val="0"/>
+                <w:color w:val="767676"/>
+                <w:sz w:val="19"/>
+              </w:rPr>
+              <w:t/>
+            </w:r>
+          </w:p>
+        </w:tc>
+      </w:tr>
+      <w:tr>
+        <w:tc>
+          <w:tcPr>
+            <w:tcW w:type="dxa" w:w="4873"/>
+          </w:tcPr>
+          <w:p>
+            <w:pPr>
+              <w:spacing w:after="0"/>
+              <w:jc w:val="right"/>
+            </w:pPr>
+            <w:r>
+              <w:rPr>
+                <w:b w:val="0"/>
+                <w:color w:val="767676"/>
+                <w:sz w:val="19"/>
+              </w:rPr>
               <w:t>Sum eks. mva</w:t>
             </w:r>
           </w:p>

</xml_diff>